<commit_message>
Se agrego el cuerpo de la documentacion
</commit_message>
<xml_diff>
--- a/Doc/Documentacion.docx
+++ b/Doc/Documentacion.docx
@@ -27,6 +27,32 @@
           <w:szCs w:val="32"/>
         </w:rPr>
       </w:pPr>
+      <w:r>
+        <w:rPr>
+          <w:rFonts w:ascii="Arial" w:hAnsi="Arial" w:cs="Arial"/>
+          <w:sz w:val="32"/>
+          <w:szCs w:val="32"/>
+        </w:rPr>
+        <w:t xml:space="preserve">Kira es un sistema de pase de lista automatizado basado en reconocimiento facial, pero esto no se queda aquí, Kira realiza un análisis profundo sobre el estado de </w:t>
+      </w:r>
+      <w:proofErr w:type="spellStart"/>
+      <w:r>
+        <w:rPr>
+          <w:rFonts w:ascii="Arial" w:hAnsi="Arial" w:cs="Arial"/>
+          <w:sz w:val="32"/>
+          <w:szCs w:val="32"/>
+        </w:rPr>
+        <w:t>animo</w:t>
+      </w:r>
+      <w:proofErr w:type="spellEnd"/>
+      <w:r>
+        <w:rPr>
+          <w:rFonts w:ascii="Arial" w:hAnsi="Arial" w:cs="Arial"/>
+          <w:sz w:val="32"/>
+          <w:szCs w:val="32"/>
+        </w:rPr>
+        <w:t xml:space="preserve"> de los alumnos y genera métricas que facilitan la ayuda a consultora académica para así evitar lo antes posibles deserciones e identificar patrones dentro de las aulas de clase.</w:t>
+      </w:r>
     </w:p>
     <w:sectPr>
       <w:pgSz w:w="12240" w:h="15840"/>

</xml_diff>

<commit_message>
Se detalla el flujo general de la aplicacion
</commit_message>
<xml_diff>
--- a/Doc/Documentacion.docx
+++ b/Doc/Documentacion.docx
@@ -350,6 +350,490 @@
           <w:szCs w:val="32"/>
         </w:rPr>
         <w:t>) para usarla en el flujo del sistema (por ejemplo: registro/validación facial o evidencia).</w:t>
+      </w:r>
+    </w:p>
+    <w:p>
+      <w:pPr>
+        <w:numPr>
+          <w:ilvl w:val="0"/>
+          <w:numId w:val="5"/>
+        </w:numPr>
+        <w:rPr>
+          <w:rFonts w:ascii="Arial" w:hAnsi="Arial" w:cs="Arial"/>
+          <w:sz w:val="32"/>
+          <w:szCs w:val="32"/>
+        </w:rPr>
+      </w:pPr>
+      <w:proofErr w:type="spellStart"/>
+      <w:r>
+        <w:rPr>
+          <w:rFonts w:ascii="Arial" w:hAnsi="Arial" w:cs="Arial"/>
+          <w:b/>
+          <w:bCs/>
+          <w:sz w:val="32"/>
+          <w:szCs w:val="32"/>
+        </w:rPr>
+        <w:t>feat</w:t>
+      </w:r>
+      <w:proofErr w:type="spellEnd"/>
+      <w:r>
+        <w:rPr>
+          <w:rFonts w:ascii="Arial" w:hAnsi="Arial" w:cs="Arial"/>
+          <w:b/>
+          <w:bCs/>
+          <w:sz w:val="32"/>
+          <w:szCs w:val="32"/>
+        </w:rPr>
+        <w:t xml:space="preserve">: </w:t>
+      </w:r>
+      <w:proofErr w:type="spellStart"/>
+      <w:r>
+        <w:rPr>
+          <w:rFonts w:ascii="Arial" w:hAnsi="Arial" w:cs="Arial"/>
+          <w:b/>
+          <w:bCs/>
+          <w:sz w:val="32"/>
+          <w:szCs w:val="32"/>
+        </w:rPr>
+        <w:t>add</w:t>
+      </w:r>
+      <w:proofErr w:type="spellEnd"/>
+      <w:r>
+        <w:rPr>
+          <w:rFonts w:ascii="Arial" w:hAnsi="Arial" w:cs="Arial"/>
+          <w:b/>
+          <w:bCs/>
+          <w:sz w:val="32"/>
+          <w:szCs w:val="32"/>
+        </w:rPr>
+        <w:t xml:space="preserve"> </w:t>
+      </w:r>
+      <w:proofErr w:type="spellStart"/>
+      <w:r>
+        <w:rPr>
+          <w:rFonts w:ascii="Arial" w:hAnsi="Arial" w:cs="Arial"/>
+          <w:b/>
+          <w:bCs/>
+          <w:sz w:val="32"/>
+          <w:szCs w:val="32"/>
+        </w:rPr>
+        <w:t>toggle</w:t>
+      </w:r>
+      <w:proofErr w:type="spellEnd"/>
+      <w:r>
+        <w:rPr>
+          <w:rFonts w:ascii="Arial" w:hAnsi="Arial" w:cs="Arial"/>
+          <w:b/>
+          <w:bCs/>
+          <w:sz w:val="32"/>
+          <w:szCs w:val="32"/>
+        </w:rPr>
+        <w:t xml:space="preserve"> </w:t>
+      </w:r>
+      <w:proofErr w:type="spellStart"/>
+      <w:r>
+        <w:rPr>
+          <w:rFonts w:ascii="Arial" w:hAnsi="Arial" w:cs="Arial"/>
+          <w:b/>
+          <w:bCs/>
+          <w:sz w:val="32"/>
+          <w:szCs w:val="32"/>
+        </w:rPr>
+        <w:t>button</w:t>
+      </w:r>
+      <w:proofErr w:type="spellEnd"/>
+    </w:p>
+    <w:p>
+      <w:pPr>
+        <w:numPr>
+          <w:ilvl w:val="0"/>
+          <w:numId w:val="6"/>
+        </w:numPr>
+        <w:rPr>
+          <w:rFonts w:ascii="Arial" w:hAnsi="Arial" w:cs="Arial"/>
+          <w:sz w:val="32"/>
+          <w:szCs w:val="32"/>
+        </w:rPr>
+      </w:pPr>
+      <w:r>
+        <w:rPr>
+          <w:rFonts w:ascii="Arial" w:hAnsi="Arial" w:cs="Arial"/>
+          <w:sz w:val="32"/>
+          <w:szCs w:val="32"/>
+        </w:rPr>
+        <w:t>Se integra un </w:t>
+      </w:r>
+      <w:r>
+        <w:rPr>
+          <w:rFonts w:ascii="Arial" w:hAnsi="Arial" w:cs="Arial"/>
+          <w:b/>
+          <w:bCs/>
+          <w:sz w:val="32"/>
+          <w:szCs w:val="32"/>
+        </w:rPr>
+        <w:t xml:space="preserve">botón tipo </w:t>
+      </w:r>
+      <w:proofErr w:type="spellStart"/>
+      <w:r>
+        <w:rPr>
+          <w:rFonts w:ascii="Arial" w:hAnsi="Arial" w:cs="Arial"/>
+          <w:b/>
+          <w:bCs/>
+          <w:sz w:val="32"/>
+          <w:szCs w:val="32"/>
+        </w:rPr>
+        <w:t>toggle</w:t>
+      </w:r>
+      <w:proofErr w:type="spellEnd"/>
+      <w:r>
+        <w:rPr>
+          <w:rFonts w:ascii="Arial" w:hAnsi="Arial" w:cs="Arial"/>
+          <w:sz w:val="32"/>
+          <w:szCs w:val="32"/>
+        </w:rPr>
+        <w:t> para controlar la cámara/</w:t>
+      </w:r>
+      <w:proofErr w:type="spellStart"/>
+      <w:r>
+        <w:rPr>
+          <w:rFonts w:ascii="Arial" w:hAnsi="Arial" w:cs="Arial"/>
+          <w:sz w:val="32"/>
+          <w:szCs w:val="32"/>
+        </w:rPr>
+        <w:t>preview</w:t>
+      </w:r>
+      <w:proofErr w:type="spellEnd"/>
+      <w:r>
+        <w:rPr>
+          <w:rFonts w:ascii="Arial" w:hAnsi="Arial" w:cs="Arial"/>
+          <w:sz w:val="32"/>
+          <w:szCs w:val="32"/>
+        </w:rPr>
+        <w:t>.</w:t>
+      </w:r>
+    </w:p>
+    <w:p>
+      <w:pPr>
+        <w:numPr>
+          <w:ilvl w:val="0"/>
+          <w:numId w:val="6"/>
+        </w:numPr>
+        <w:rPr>
+          <w:rFonts w:ascii="Arial" w:hAnsi="Arial" w:cs="Arial"/>
+          <w:sz w:val="32"/>
+          <w:szCs w:val="32"/>
+        </w:rPr>
+      </w:pPr>
+      <w:r>
+        <w:rPr>
+          <w:rFonts w:ascii="Arial" w:hAnsi="Arial" w:cs="Arial"/>
+          <w:sz w:val="32"/>
+          <w:szCs w:val="32"/>
+        </w:rPr>
+        <w:t>Sirve para </w:t>
+      </w:r>
+      <w:r>
+        <w:rPr>
+          <w:rFonts w:ascii="Arial" w:hAnsi="Arial" w:cs="Arial"/>
+          <w:b/>
+          <w:bCs/>
+          <w:sz w:val="32"/>
+          <w:szCs w:val="32"/>
+        </w:rPr>
+        <w:t>activar/desactivar</w:t>
+      </w:r>
+      <w:r>
+        <w:rPr>
+          <w:rFonts w:ascii="Arial" w:hAnsi="Arial" w:cs="Arial"/>
+          <w:sz w:val="32"/>
+          <w:szCs w:val="32"/>
+        </w:rPr>
+        <w:t xml:space="preserve"> la cámara o mostrar/ocultar el </w:t>
+      </w:r>
+      <w:proofErr w:type="spellStart"/>
+      <w:r>
+        <w:rPr>
+          <w:rFonts w:ascii="Arial" w:hAnsi="Arial" w:cs="Arial"/>
+          <w:sz w:val="32"/>
+          <w:szCs w:val="32"/>
+        </w:rPr>
+        <w:t>preview</w:t>
+      </w:r>
+      <w:proofErr w:type="spellEnd"/>
+      <w:r>
+        <w:rPr>
+          <w:rFonts w:ascii="Arial" w:hAnsi="Arial" w:cs="Arial"/>
+          <w:sz w:val="32"/>
+          <w:szCs w:val="32"/>
+        </w:rPr>
+        <w:t xml:space="preserve"> según el estado.</w:t>
+      </w:r>
+    </w:p>
+    <w:p>
+      <w:pPr>
+        <w:numPr>
+          <w:ilvl w:val="0"/>
+          <w:numId w:val="6"/>
+        </w:numPr>
+        <w:rPr>
+          <w:rFonts w:ascii="Arial" w:hAnsi="Arial" w:cs="Arial"/>
+          <w:sz w:val="32"/>
+          <w:szCs w:val="32"/>
+        </w:rPr>
+      </w:pPr>
+      <w:r>
+        <w:rPr>
+          <w:rFonts w:ascii="Arial" w:hAnsi="Arial" w:cs="Arial"/>
+          <w:sz w:val="32"/>
+          <w:szCs w:val="32"/>
+        </w:rPr>
+        <w:t>Mejora la usabilidad al darle control directo al usuario.</w:t>
+      </w:r>
+    </w:p>
+    <w:p>
+      <w:pPr>
+        <w:rPr>
+          <w:rFonts w:ascii="Arial" w:hAnsi="Arial" w:cs="Arial"/>
+          <w:b/>
+          <w:bCs/>
+          <w:sz w:val="32"/>
+          <w:szCs w:val="32"/>
+        </w:rPr>
+      </w:pPr>
+      <w:r>
+        <w:rPr>
+          <w:rFonts w:ascii="Arial" w:hAnsi="Arial" w:cs="Arial"/>
+          <w:b/>
+          <w:bCs/>
+          <w:sz w:val="32"/>
+          <w:szCs w:val="32"/>
+        </w:rPr>
+        <w:t>Cómo se usa (flujo general)</w:t>
+      </w:r>
+    </w:p>
+    <w:p>
+      <w:pPr>
+        <w:numPr>
+          <w:ilvl w:val="0"/>
+          <w:numId w:val="7"/>
+        </w:numPr>
+        <w:rPr>
+          <w:rFonts w:ascii="Arial" w:hAnsi="Arial" w:cs="Arial"/>
+          <w:sz w:val="32"/>
+          <w:szCs w:val="32"/>
+        </w:rPr>
+      </w:pPr>
+      <w:r>
+        <w:rPr>
+          <w:rFonts w:ascii="Arial" w:hAnsi="Arial" w:cs="Arial"/>
+          <w:sz w:val="32"/>
+          <w:szCs w:val="32"/>
+        </w:rPr>
+        <w:t>El usuario abre la pantalla donde está la webcam.</w:t>
+      </w:r>
+    </w:p>
+    <w:p>
+      <w:pPr>
+        <w:numPr>
+          <w:ilvl w:val="0"/>
+          <w:numId w:val="7"/>
+        </w:numPr>
+        <w:rPr>
+          <w:rFonts w:ascii="Arial" w:hAnsi="Arial" w:cs="Arial"/>
+          <w:sz w:val="32"/>
+          <w:szCs w:val="32"/>
+        </w:rPr>
+      </w:pPr>
+      <w:r>
+        <w:rPr>
+          <w:rFonts w:ascii="Arial" w:hAnsi="Arial" w:cs="Arial"/>
+          <w:sz w:val="32"/>
+          <w:szCs w:val="32"/>
+        </w:rPr>
+        <w:t>Acepta permisos de cámara (si se solicitan).</w:t>
+      </w:r>
+    </w:p>
+    <w:p>
+      <w:pPr>
+        <w:numPr>
+          <w:ilvl w:val="0"/>
+          <w:numId w:val="7"/>
+        </w:numPr>
+        <w:rPr>
+          <w:rFonts w:ascii="Arial" w:hAnsi="Arial" w:cs="Arial"/>
+          <w:sz w:val="32"/>
+          <w:szCs w:val="32"/>
+        </w:rPr>
+      </w:pPr>
+      <w:r>
+        <w:rPr>
+          <w:rFonts w:ascii="Arial" w:hAnsi="Arial" w:cs="Arial"/>
+          <w:sz w:val="32"/>
+          <w:szCs w:val="32"/>
+        </w:rPr>
+        <w:t xml:space="preserve">Ve el </w:t>
+      </w:r>
+      <w:proofErr w:type="spellStart"/>
+      <w:r>
+        <w:rPr>
+          <w:rFonts w:ascii="Arial" w:hAnsi="Arial" w:cs="Arial"/>
+          <w:sz w:val="32"/>
+          <w:szCs w:val="32"/>
+        </w:rPr>
+        <w:t>preview</w:t>
+      </w:r>
+      <w:proofErr w:type="spellEnd"/>
+      <w:r>
+        <w:rPr>
+          <w:rFonts w:ascii="Arial" w:hAnsi="Arial" w:cs="Arial"/>
+          <w:sz w:val="32"/>
+          <w:szCs w:val="32"/>
+        </w:rPr>
+        <w:t xml:space="preserve"> en vivo.</w:t>
+      </w:r>
+    </w:p>
+    <w:p>
+      <w:pPr>
+        <w:numPr>
+          <w:ilvl w:val="0"/>
+          <w:numId w:val="7"/>
+        </w:numPr>
+        <w:rPr>
+          <w:rFonts w:ascii="Arial" w:hAnsi="Arial" w:cs="Arial"/>
+          <w:sz w:val="32"/>
+          <w:szCs w:val="32"/>
+        </w:rPr>
+      </w:pPr>
+      <w:r>
+        <w:rPr>
+          <w:rFonts w:ascii="Arial" w:hAnsi="Arial" w:cs="Arial"/>
+          <w:sz w:val="32"/>
+          <w:szCs w:val="32"/>
+        </w:rPr>
+        <w:t>Puede presionar </w:t>
+      </w:r>
+      <w:proofErr w:type="spellStart"/>
+      <w:r>
+        <w:rPr>
+          <w:rFonts w:ascii="Arial" w:hAnsi="Arial" w:cs="Arial"/>
+          <w:b/>
+          <w:bCs/>
+          <w:sz w:val="32"/>
+          <w:szCs w:val="32"/>
+        </w:rPr>
+        <w:t>toggle</w:t>
+      </w:r>
+      <w:proofErr w:type="spellEnd"/>
+      <w:r>
+        <w:rPr>
+          <w:rFonts w:ascii="Arial" w:hAnsi="Arial" w:cs="Arial"/>
+          <w:sz w:val="32"/>
+          <w:szCs w:val="32"/>
+        </w:rPr>
+        <w:t> para activar/desactivar.</w:t>
+      </w:r>
+    </w:p>
+    <w:p>
+      <w:pPr>
+        <w:numPr>
+          <w:ilvl w:val="0"/>
+          <w:numId w:val="7"/>
+        </w:numPr>
+        <w:rPr>
+          <w:rFonts w:ascii="Arial" w:hAnsi="Arial" w:cs="Arial"/>
+          <w:sz w:val="32"/>
+          <w:szCs w:val="32"/>
+        </w:rPr>
+      </w:pPr>
+      <w:r>
+        <w:rPr>
+          <w:rFonts w:ascii="Arial" w:hAnsi="Arial" w:cs="Arial"/>
+          <w:sz w:val="32"/>
+          <w:szCs w:val="32"/>
+        </w:rPr>
+        <w:t>Puede presionar </w:t>
+      </w:r>
+      <w:r>
+        <w:rPr>
+          <w:rFonts w:ascii="Arial" w:hAnsi="Arial" w:cs="Arial"/>
+          <w:b/>
+          <w:bCs/>
+          <w:sz w:val="32"/>
+          <w:szCs w:val="32"/>
+        </w:rPr>
+        <w:t>tomar foto</w:t>
+      </w:r>
+      <w:r>
+        <w:rPr>
+          <w:rFonts w:ascii="Arial" w:hAnsi="Arial" w:cs="Arial"/>
+          <w:sz w:val="32"/>
+          <w:szCs w:val="32"/>
+        </w:rPr>
+        <w:t> para capturar una imagen.</w:t>
+      </w:r>
+    </w:p>
+    <w:p>
+      <w:pPr>
+        <w:rPr>
+          <w:rFonts w:ascii="Arial" w:hAnsi="Arial" w:cs="Arial"/>
+          <w:b/>
+          <w:bCs/>
+          <w:sz w:val="32"/>
+          <w:szCs w:val="32"/>
+        </w:rPr>
+      </w:pPr>
+      <w:r>
+        <w:rPr>
+          <w:rFonts w:ascii="Arial" w:hAnsi="Arial" w:cs="Arial"/>
+          <w:b/>
+          <w:bCs/>
+          <w:sz w:val="32"/>
+          <w:szCs w:val="32"/>
+        </w:rPr>
+        <w:t>Notas rápidas</w:t>
+      </w:r>
+    </w:p>
+    <w:p>
+      <w:pPr>
+        <w:numPr>
+          <w:ilvl w:val="0"/>
+          <w:numId w:val="8"/>
+        </w:numPr>
+        <w:rPr>
+          <w:rFonts w:ascii="Arial" w:hAnsi="Arial" w:cs="Arial"/>
+          <w:sz w:val="32"/>
+          <w:szCs w:val="32"/>
+        </w:rPr>
+      </w:pPr>
+      <w:r>
+        <w:rPr>
+          <w:rFonts w:ascii="Arial" w:hAnsi="Arial" w:cs="Arial"/>
+          <w:sz w:val="32"/>
+          <w:szCs w:val="32"/>
+        </w:rPr>
+        <w:lastRenderedPageBreak/>
+        <w:t>Depende del soporte del navegador y de permisos de cámara.</w:t>
+      </w:r>
+    </w:p>
+    <w:p>
+      <w:pPr>
+        <w:numPr>
+          <w:ilvl w:val="0"/>
+          <w:numId w:val="8"/>
+        </w:numPr>
+        <w:rPr>
+          <w:rFonts w:ascii="Arial" w:hAnsi="Arial" w:cs="Arial"/>
+          <w:sz w:val="32"/>
+          <w:szCs w:val="32"/>
+        </w:rPr>
+      </w:pPr>
+      <w:r>
+        <w:rPr>
+          <w:rFonts w:ascii="Arial" w:hAnsi="Arial" w:cs="Arial"/>
+          <w:sz w:val="32"/>
+          <w:szCs w:val="32"/>
+        </w:rPr>
+        <w:t>Si el usuario deniega permisos, la funcionalidad no se activa y debería mostrarse un mensaje/estado alternativo (según implementación).</w:t>
       </w:r>
     </w:p>
     <w:p>
@@ -645,6 +1129,268 @@
     </w:lvl>
   </w:abstractNum>
   <w:abstractNum w:abstractNumId="2" w15:restartNumberingAfterBreak="0">
+    <w:nsid w:val="2E635542"/>
+    <w:multiLevelType w:val="multilevel"/>
+    <w:tmpl w:val="212612A2"/>
+    <w:lvl w:ilvl="0">
+      <w:start w:val="1"/>
+      <w:numFmt w:val="decimal"/>
+      <w:lvlText w:val="%1."/>
+      <w:lvlJc w:val="left"/>
+      <w:pPr>
+        <w:tabs>
+          <w:tab w:val="num" w:pos="720"/>
+        </w:tabs>
+        <w:ind w:left="720" w:hanging="360"/>
+      </w:pPr>
+    </w:lvl>
+    <w:lvl w:ilvl="1" w:tentative="1">
+      <w:start w:val="1"/>
+      <w:numFmt w:val="decimal"/>
+      <w:lvlText w:val="%2."/>
+      <w:lvlJc w:val="left"/>
+      <w:pPr>
+        <w:tabs>
+          <w:tab w:val="num" w:pos="1440"/>
+        </w:tabs>
+        <w:ind w:left="1440" w:hanging="360"/>
+      </w:pPr>
+    </w:lvl>
+    <w:lvl w:ilvl="2" w:tentative="1">
+      <w:start w:val="1"/>
+      <w:numFmt w:val="decimal"/>
+      <w:lvlText w:val="%3."/>
+      <w:lvlJc w:val="left"/>
+      <w:pPr>
+        <w:tabs>
+          <w:tab w:val="num" w:pos="2160"/>
+        </w:tabs>
+        <w:ind w:left="2160" w:hanging="360"/>
+      </w:pPr>
+    </w:lvl>
+    <w:lvl w:ilvl="3" w:tentative="1">
+      <w:start w:val="1"/>
+      <w:numFmt w:val="decimal"/>
+      <w:lvlText w:val="%4."/>
+      <w:lvlJc w:val="left"/>
+      <w:pPr>
+        <w:tabs>
+          <w:tab w:val="num" w:pos="2880"/>
+        </w:tabs>
+        <w:ind w:left="2880" w:hanging="360"/>
+      </w:pPr>
+    </w:lvl>
+    <w:lvl w:ilvl="4" w:tentative="1">
+      <w:start w:val="1"/>
+      <w:numFmt w:val="decimal"/>
+      <w:lvlText w:val="%5."/>
+      <w:lvlJc w:val="left"/>
+      <w:pPr>
+        <w:tabs>
+          <w:tab w:val="num" w:pos="3600"/>
+        </w:tabs>
+        <w:ind w:left="3600" w:hanging="360"/>
+      </w:pPr>
+    </w:lvl>
+    <w:lvl w:ilvl="5" w:tentative="1">
+      <w:start w:val="1"/>
+      <w:numFmt w:val="decimal"/>
+      <w:lvlText w:val="%6."/>
+      <w:lvlJc w:val="left"/>
+      <w:pPr>
+        <w:tabs>
+          <w:tab w:val="num" w:pos="4320"/>
+        </w:tabs>
+        <w:ind w:left="4320" w:hanging="360"/>
+      </w:pPr>
+    </w:lvl>
+    <w:lvl w:ilvl="6" w:tentative="1">
+      <w:start w:val="1"/>
+      <w:numFmt w:val="decimal"/>
+      <w:lvlText w:val="%7."/>
+      <w:lvlJc w:val="left"/>
+      <w:pPr>
+        <w:tabs>
+          <w:tab w:val="num" w:pos="5040"/>
+        </w:tabs>
+        <w:ind w:left="5040" w:hanging="360"/>
+      </w:pPr>
+    </w:lvl>
+    <w:lvl w:ilvl="7" w:tentative="1">
+      <w:start w:val="1"/>
+      <w:numFmt w:val="decimal"/>
+      <w:lvlText w:val="%8."/>
+      <w:lvlJc w:val="left"/>
+      <w:pPr>
+        <w:tabs>
+          <w:tab w:val="num" w:pos="5760"/>
+        </w:tabs>
+        <w:ind w:left="5760" w:hanging="360"/>
+      </w:pPr>
+    </w:lvl>
+    <w:lvl w:ilvl="8" w:tentative="1">
+      <w:start w:val="1"/>
+      <w:numFmt w:val="decimal"/>
+      <w:lvlText w:val="%9."/>
+      <w:lvlJc w:val="left"/>
+      <w:pPr>
+        <w:tabs>
+          <w:tab w:val="num" w:pos="6480"/>
+        </w:tabs>
+        <w:ind w:left="6480" w:hanging="360"/>
+      </w:pPr>
+    </w:lvl>
+  </w:abstractNum>
+  <w:abstractNum w:abstractNumId="3" w15:restartNumberingAfterBreak="0">
+    <w:nsid w:val="3A0500C1"/>
+    <w:multiLevelType w:val="multilevel"/>
+    <w:tmpl w:val="2D9C3BE0"/>
+    <w:lvl w:ilvl="0">
+      <w:start w:val="1"/>
+      <w:numFmt w:val="bullet"/>
+      <w:lvlText w:val=""/>
+      <w:lvlJc w:val="left"/>
+      <w:pPr>
+        <w:tabs>
+          <w:tab w:val="num" w:pos="720"/>
+        </w:tabs>
+        <w:ind w:left="720" w:hanging="360"/>
+      </w:pPr>
+      <w:rPr>
+        <w:rFonts w:ascii="Symbol" w:hAnsi="Symbol" w:hint="default"/>
+        <w:sz w:val="20"/>
+      </w:rPr>
+    </w:lvl>
+    <w:lvl w:ilvl="1" w:tentative="1">
+      <w:start w:val="1"/>
+      <w:numFmt w:val="bullet"/>
+      <w:lvlText w:val="o"/>
+      <w:lvlJc w:val="left"/>
+      <w:pPr>
+        <w:tabs>
+          <w:tab w:val="num" w:pos="1440"/>
+        </w:tabs>
+        <w:ind w:left="1440" w:hanging="360"/>
+      </w:pPr>
+      <w:rPr>
+        <w:rFonts w:ascii="Courier New" w:hAnsi="Courier New" w:hint="default"/>
+        <w:sz w:val="20"/>
+      </w:rPr>
+    </w:lvl>
+    <w:lvl w:ilvl="2" w:tentative="1">
+      <w:start w:val="1"/>
+      <w:numFmt w:val="bullet"/>
+      <w:lvlText w:val=""/>
+      <w:lvlJc w:val="left"/>
+      <w:pPr>
+        <w:tabs>
+          <w:tab w:val="num" w:pos="2160"/>
+        </w:tabs>
+        <w:ind w:left="2160" w:hanging="360"/>
+      </w:pPr>
+      <w:rPr>
+        <w:rFonts w:ascii="Wingdings" w:hAnsi="Wingdings" w:hint="default"/>
+        <w:sz w:val="20"/>
+      </w:rPr>
+    </w:lvl>
+    <w:lvl w:ilvl="3" w:tentative="1">
+      <w:start w:val="1"/>
+      <w:numFmt w:val="bullet"/>
+      <w:lvlText w:val=""/>
+      <w:lvlJc w:val="left"/>
+      <w:pPr>
+        <w:tabs>
+          <w:tab w:val="num" w:pos="2880"/>
+        </w:tabs>
+        <w:ind w:left="2880" w:hanging="360"/>
+      </w:pPr>
+      <w:rPr>
+        <w:rFonts w:ascii="Wingdings" w:hAnsi="Wingdings" w:hint="default"/>
+        <w:sz w:val="20"/>
+      </w:rPr>
+    </w:lvl>
+    <w:lvl w:ilvl="4" w:tentative="1">
+      <w:start w:val="1"/>
+      <w:numFmt w:val="bullet"/>
+      <w:lvlText w:val=""/>
+      <w:lvlJc w:val="left"/>
+      <w:pPr>
+        <w:tabs>
+          <w:tab w:val="num" w:pos="3600"/>
+        </w:tabs>
+        <w:ind w:left="3600" w:hanging="360"/>
+      </w:pPr>
+      <w:rPr>
+        <w:rFonts w:ascii="Wingdings" w:hAnsi="Wingdings" w:hint="default"/>
+        <w:sz w:val="20"/>
+      </w:rPr>
+    </w:lvl>
+    <w:lvl w:ilvl="5" w:tentative="1">
+      <w:start w:val="1"/>
+      <w:numFmt w:val="bullet"/>
+      <w:lvlText w:val=""/>
+      <w:lvlJc w:val="left"/>
+      <w:pPr>
+        <w:tabs>
+          <w:tab w:val="num" w:pos="4320"/>
+        </w:tabs>
+        <w:ind w:left="4320" w:hanging="360"/>
+      </w:pPr>
+      <w:rPr>
+        <w:rFonts w:ascii="Wingdings" w:hAnsi="Wingdings" w:hint="default"/>
+        <w:sz w:val="20"/>
+      </w:rPr>
+    </w:lvl>
+    <w:lvl w:ilvl="6" w:tentative="1">
+      <w:start w:val="1"/>
+      <w:numFmt w:val="bullet"/>
+      <w:lvlText w:val=""/>
+      <w:lvlJc w:val="left"/>
+      <w:pPr>
+        <w:tabs>
+          <w:tab w:val="num" w:pos="5040"/>
+        </w:tabs>
+        <w:ind w:left="5040" w:hanging="360"/>
+      </w:pPr>
+      <w:rPr>
+        <w:rFonts w:ascii="Wingdings" w:hAnsi="Wingdings" w:hint="default"/>
+        <w:sz w:val="20"/>
+      </w:rPr>
+    </w:lvl>
+    <w:lvl w:ilvl="7" w:tentative="1">
+      <w:start w:val="1"/>
+      <w:numFmt w:val="bullet"/>
+      <w:lvlText w:val=""/>
+      <w:lvlJc w:val="left"/>
+      <w:pPr>
+        <w:tabs>
+          <w:tab w:val="num" w:pos="5760"/>
+        </w:tabs>
+        <w:ind w:left="5760" w:hanging="360"/>
+      </w:pPr>
+      <w:rPr>
+        <w:rFonts w:ascii="Wingdings" w:hAnsi="Wingdings" w:hint="default"/>
+        <w:sz w:val="20"/>
+      </w:rPr>
+    </w:lvl>
+    <w:lvl w:ilvl="8" w:tentative="1">
+      <w:start w:val="1"/>
+      <w:numFmt w:val="bullet"/>
+      <w:lvlText w:val=""/>
+      <w:lvlJc w:val="left"/>
+      <w:pPr>
+        <w:tabs>
+          <w:tab w:val="num" w:pos="6480"/>
+        </w:tabs>
+        <w:ind w:left="6480" w:hanging="360"/>
+      </w:pPr>
+      <w:rPr>
+        <w:rFonts w:ascii="Wingdings" w:hAnsi="Wingdings" w:hint="default"/>
+        <w:sz w:val="20"/>
+      </w:rPr>
+    </w:lvl>
+  </w:abstractNum>
+  <w:abstractNum w:abstractNumId="4" w15:restartNumberingAfterBreak="0">
     <w:nsid w:val="3D03622A"/>
     <w:multiLevelType w:val="multilevel"/>
     <w:tmpl w:val="833AE2D6"/>
@@ -757,10 +1503,272 @@
       </w:pPr>
     </w:lvl>
   </w:abstractNum>
-  <w:abstractNum w:abstractNumId="3" w15:restartNumberingAfterBreak="0">
+  <w:abstractNum w:abstractNumId="5" w15:restartNumberingAfterBreak="0">
     <w:nsid w:val="6D577C98"/>
     <w:multiLevelType w:val="multilevel"/>
     <w:tmpl w:val="6038AD68"/>
+    <w:lvl w:ilvl="0">
+      <w:start w:val="1"/>
+      <w:numFmt w:val="bullet"/>
+      <w:lvlText w:val=""/>
+      <w:lvlJc w:val="left"/>
+      <w:pPr>
+        <w:tabs>
+          <w:tab w:val="num" w:pos="720"/>
+        </w:tabs>
+        <w:ind w:left="720" w:hanging="360"/>
+      </w:pPr>
+      <w:rPr>
+        <w:rFonts w:ascii="Symbol" w:hAnsi="Symbol" w:hint="default"/>
+        <w:sz w:val="20"/>
+      </w:rPr>
+    </w:lvl>
+    <w:lvl w:ilvl="1" w:tentative="1">
+      <w:start w:val="1"/>
+      <w:numFmt w:val="bullet"/>
+      <w:lvlText w:val="o"/>
+      <w:lvlJc w:val="left"/>
+      <w:pPr>
+        <w:tabs>
+          <w:tab w:val="num" w:pos="1440"/>
+        </w:tabs>
+        <w:ind w:left="1440" w:hanging="360"/>
+      </w:pPr>
+      <w:rPr>
+        <w:rFonts w:ascii="Courier New" w:hAnsi="Courier New" w:hint="default"/>
+        <w:sz w:val="20"/>
+      </w:rPr>
+    </w:lvl>
+    <w:lvl w:ilvl="2" w:tentative="1">
+      <w:start w:val="1"/>
+      <w:numFmt w:val="bullet"/>
+      <w:lvlText w:val=""/>
+      <w:lvlJc w:val="left"/>
+      <w:pPr>
+        <w:tabs>
+          <w:tab w:val="num" w:pos="2160"/>
+        </w:tabs>
+        <w:ind w:left="2160" w:hanging="360"/>
+      </w:pPr>
+      <w:rPr>
+        <w:rFonts w:ascii="Wingdings" w:hAnsi="Wingdings" w:hint="default"/>
+        <w:sz w:val="20"/>
+      </w:rPr>
+    </w:lvl>
+    <w:lvl w:ilvl="3" w:tentative="1">
+      <w:start w:val="1"/>
+      <w:numFmt w:val="bullet"/>
+      <w:lvlText w:val=""/>
+      <w:lvlJc w:val="left"/>
+      <w:pPr>
+        <w:tabs>
+          <w:tab w:val="num" w:pos="2880"/>
+        </w:tabs>
+        <w:ind w:left="2880" w:hanging="360"/>
+      </w:pPr>
+      <w:rPr>
+        <w:rFonts w:ascii="Wingdings" w:hAnsi="Wingdings" w:hint="default"/>
+        <w:sz w:val="20"/>
+      </w:rPr>
+    </w:lvl>
+    <w:lvl w:ilvl="4" w:tentative="1">
+      <w:start w:val="1"/>
+      <w:numFmt w:val="bullet"/>
+      <w:lvlText w:val=""/>
+      <w:lvlJc w:val="left"/>
+      <w:pPr>
+        <w:tabs>
+          <w:tab w:val="num" w:pos="3600"/>
+        </w:tabs>
+        <w:ind w:left="3600" w:hanging="360"/>
+      </w:pPr>
+      <w:rPr>
+        <w:rFonts w:ascii="Wingdings" w:hAnsi="Wingdings" w:hint="default"/>
+        <w:sz w:val="20"/>
+      </w:rPr>
+    </w:lvl>
+    <w:lvl w:ilvl="5" w:tentative="1">
+      <w:start w:val="1"/>
+      <w:numFmt w:val="bullet"/>
+      <w:lvlText w:val=""/>
+      <w:lvlJc w:val="left"/>
+      <w:pPr>
+        <w:tabs>
+          <w:tab w:val="num" w:pos="4320"/>
+        </w:tabs>
+        <w:ind w:left="4320" w:hanging="360"/>
+      </w:pPr>
+      <w:rPr>
+        <w:rFonts w:ascii="Wingdings" w:hAnsi="Wingdings" w:hint="default"/>
+        <w:sz w:val="20"/>
+      </w:rPr>
+    </w:lvl>
+    <w:lvl w:ilvl="6" w:tentative="1">
+      <w:start w:val="1"/>
+      <w:numFmt w:val="bullet"/>
+      <w:lvlText w:val=""/>
+      <w:lvlJc w:val="left"/>
+      <w:pPr>
+        <w:tabs>
+          <w:tab w:val="num" w:pos="5040"/>
+        </w:tabs>
+        <w:ind w:left="5040" w:hanging="360"/>
+      </w:pPr>
+      <w:rPr>
+        <w:rFonts w:ascii="Wingdings" w:hAnsi="Wingdings" w:hint="default"/>
+        <w:sz w:val="20"/>
+      </w:rPr>
+    </w:lvl>
+    <w:lvl w:ilvl="7" w:tentative="1">
+      <w:start w:val="1"/>
+      <w:numFmt w:val="bullet"/>
+      <w:lvlText w:val=""/>
+      <w:lvlJc w:val="left"/>
+      <w:pPr>
+        <w:tabs>
+          <w:tab w:val="num" w:pos="5760"/>
+        </w:tabs>
+        <w:ind w:left="5760" w:hanging="360"/>
+      </w:pPr>
+      <w:rPr>
+        <w:rFonts w:ascii="Wingdings" w:hAnsi="Wingdings" w:hint="default"/>
+        <w:sz w:val="20"/>
+      </w:rPr>
+    </w:lvl>
+    <w:lvl w:ilvl="8" w:tentative="1">
+      <w:start w:val="1"/>
+      <w:numFmt w:val="bullet"/>
+      <w:lvlText w:val=""/>
+      <w:lvlJc w:val="left"/>
+      <w:pPr>
+        <w:tabs>
+          <w:tab w:val="num" w:pos="6480"/>
+        </w:tabs>
+        <w:ind w:left="6480" w:hanging="360"/>
+      </w:pPr>
+      <w:rPr>
+        <w:rFonts w:ascii="Wingdings" w:hAnsi="Wingdings" w:hint="default"/>
+        <w:sz w:val="20"/>
+      </w:rPr>
+    </w:lvl>
+  </w:abstractNum>
+  <w:abstractNum w:abstractNumId="6" w15:restartNumberingAfterBreak="0">
+    <w:nsid w:val="762C444B"/>
+    <w:multiLevelType w:val="multilevel"/>
+    <w:tmpl w:val="694614F4"/>
+    <w:lvl w:ilvl="0">
+      <w:start w:val="3"/>
+      <w:numFmt w:val="decimal"/>
+      <w:lvlText w:val="%1."/>
+      <w:lvlJc w:val="left"/>
+      <w:pPr>
+        <w:tabs>
+          <w:tab w:val="num" w:pos="720"/>
+        </w:tabs>
+        <w:ind w:left="720" w:hanging="360"/>
+      </w:pPr>
+    </w:lvl>
+    <w:lvl w:ilvl="1" w:tentative="1">
+      <w:start w:val="1"/>
+      <w:numFmt w:val="decimal"/>
+      <w:lvlText w:val="%2."/>
+      <w:lvlJc w:val="left"/>
+      <w:pPr>
+        <w:tabs>
+          <w:tab w:val="num" w:pos="1440"/>
+        </w:tabs>
+        <w:ind w:left="1440" w:hanging="360"/>
+      </w:pPr>
+    </w:lvl>
+    <w:lvl w:ilvl="2" w:tentative="1">
+      <w:start w:val="1"/>
+      <w:numFmt w:val="decimal"/>
+      <w:lvlText w:val="%3."/>
+      <w:lvlJc w:val="left"/>
+      <w:pPr>
+        <w:tabs>
+          <w:tab w:val="num" w:pos="2160"/>
+        </w:tabs>
+        <w:ind w:left="2160" w:hanging="360"/>
+      </w:pPr>
+    </w:lvl>
+    <w:lvl w:ilvl="3" w:tentative="1">
+      <w:start w:val="1"/>
+      <w:numFmt w:val="decimal"/>
+      <w:lvlText w:val="%4."/>
+      <w:lvlJc w:val="left"/>
+      <w:pPr>
+        <w:tabs>
+          <w:tab w:val="num" w:pos="2880"/>
+        </w:tabs>
+        <w:ind w:left="2880" w:hanging="360"/>
+      </w:pPr>
+    </w:lvl>
+    <w:lvl w:ilvl="4" w:tentative="1">
+      <w:start w:val="1"/>
+      <w:numFmt w:val="decimal"/>
+      <w:lvlText w:val="%5."/>
+      <w:lvlJc w:val="left"/>
+      <w:pPr>
+        <w:tabs>
+          <w:tab w:val="num" w:pos="3600"/>
+        </w:tabs>
+        <w:ind w:left="3600" w:hanging="360"/>
+      </w:pPr>
+    </w:lvl>
+    <w:lvl w:ilvl="5" w:tentative="1">
+      <w:start w:val="1"/>
+      <w:numFmt w:val="decimal"/>
+      <w:lvlText w:val="%6."/>
+      <w:lvlJc w:val="left"/>
+      <w:pPr>
+        <w:tabs>
+          <w:tab w:val="num" w:pos="4320"/>
+        </w:tabs>
+        <w:ind w:left="4320" w:hanging="360"/>
+      </w:pPr>
+    </w:lvl>
+    <w:lvl w:ilvl="6" w:tentative="1">
+      <w:start w:val="1"/>
+      <w:numFmt w:val="decimal"/>
+      <w:lvlText w:val="%7."/>
+      <w:lvlJc w:val="left"/>
+      <w:pPr>
+        <w:tabs>
+          <w:tab w:val="num" w:pos="5040"/>
+        </w:tabs>
+        <w:ind w:left="5040" w:hanging="360"/>
+      </w:pPr>
+    </w:lvl>
+    <w:lvl w:ilvl="7" w:tentative="1">
+      <w:start w:val="1"/>
+      <w:numFmt w:val="decimal"/>
+      <w:lvlText w:val="%8."/>
+      <w:lvlJc w:val="left"/>
+      <w:pPr>
+        <w:tabs>
+          <w:tab w:val="num" w:pos="5760"/>
+        </w:tabs>
+        <w:ind w:left="5760" w:hanging="360"/>
+      </w:pPr>
+    </w:lvl>
+    <w:lvl w:ilvl="8" w:tentative="1">
+      <w:start w:val="1"/>
+      <w:numFmt w:val="decimal"/>
+      <w:lvlText w:val="%9."/>
+      <w:lvlJc w:val="left"/>
+      <w:pPr>
+        <w:tabs>
+          <w:tab w:val="num" w:pos="6480"/>
+        </w:tabs>
+        <w:ind w:left="6480" w:hanging="360"/>
+      </w:pPr>
+    </w:lvl>
+  </w:abstractNum>
+  <w:abstractNum w:abstractNumId="7" w15:restartNumberingAfterBreak="0">
+    <w:nsid w:val="7EAB2AC1"/>
+    <w:multiLevelType w:val="multilevel"/>
+    <w:tmpl w:val="CBF279FA"/>
     <w:lvl w:ilvl="0">
       <w:start w:val="1"/>
       <w:numFmt w:val="bullet"/>
@@ -910,13 +1918,25 @@
     <w:abstractNumId w:val="1"/>
   </w:num>
   <w:num w:numId="2" w16cid:durableId="243223581">
-    <w:abstractNumId w:val="3"/>
+    <w:abstractNumId w:val="5"/>
   </w:num>
   <w:num w:numId="3" w16cid:durableId="1807695982">
-    <w:abstractNumId w:val="2"/>
+    <w:abstractNumId w:val="4"/>
   </w:num>
   <w:num w:numId="4" w16cid:durableId="739980736">
     <w:abstractNumId w:val="0"/>
+  </w:num>
+  <w:num w:numId="5" w16cid:durableId="669257980">
+    <w:abstractNumId w:val="6"/>
+  </w:num>
+  <w:num w:numId="6" w16cid:durableId="627903978">
+    <w:abstractNumId w:val="3"/>
+  </w:num>
+  <w:num w:numId="7" w16cid:durableId="727189867">
+    <w:abstractNumId w:val="2"/>
+  </w:num>
+  <w:num w:numId="8" w16cid:durableId="2121490814">
+    <w:abstractNumId w:val="7"/>
   </w:num>
 </w:numbering>
 </file>

</xml_diff>

<commit_message>
Se especifica el gestor de base de datos
</commit_message>
<xml_diff>
--- a/Doc/Documentacion.docx
+++ b/Doc/Documentacion.docx
@@ -851,6 +851,7 @@
           <w:rFonts w:ascii="Arial" w:hAnsi="Arial" w:cs="Arial"/>
           <w:sz w:val="32"/>
           <w:szCs w:val="32"/>
+          <w:lang w:val="en-US"/>
         </w:rPr>
       </w:pPr>
       <w:proofErr w:type="spellStart"/>
@@ -871,6 +872,58 @@
         </w:rPr>
         <w:t xml:space="preserve"> de la base de datos</w:t>
       </w:r>
+    </w:p>
+    <w:p>
+      <w:pPr>
+        <w:rPr>
+          <w:rFonts w:ascii="Arial" w:hAnsi="Arial" w:cs="Arial"/>
+          <w:sz w:val="32"/>
+          <w:szCs w:val="32"/>
+        </w:rPr>
+      </w:pPr>
+      <w:r>
+        <w:rPr>
+          <w:rFonts w:ascii="Arial" w:hAnsi="Arial" w:cs="Arial"/>
+          <w:sz w:val="32"/>
+          <w:szCs w:val="32"/>
+        </w:rPr>
+        <w:t xml:space="preserve">Se </w:t>
+      </w:r>
+      <w:proofErr w:type="gramStart"/>
+      <w:r>
+        <w:rPr>
+          <w:rFonts w:ascii="Arial" w:hAnsi="Arial" w:cs="Arial"/>
+          <w:sz w:val="32"/>
+          <w:szCs w:val="32"/>
+        </w:rPr>
+        <w:t>realizara</w:t>
+      </w:r>
+      <w:proofErr w:type="gramEnd"/>
+      <w:r>
+        <w:rPr>
+          <w:rFonts w:ascii="Arial" w:hAnsi="Arial" w:cs="Arial"/>
+          <w:sz w:val="32"/>
+          <w:szCs w:val="32"/>
+        </w:rPr>
+        <w:t xml:space="preserve"> en PostgreSQL con u</w:t>
+      </w:r>
+      <w:r>
+        <w:rPr>
+          <w:rFonts w:ascii="Arial" w:hAnsi="Arial" w:cs="Arial"/>
+          <w:sz w:val="32"/>
+          <w:szCs w:val="32"/>
+        </w:rPr>
+        <w:t>n contenedor de Docker.</w:t>
+      </w:r>
+    </w:p>
+    <w:p>
+      <w:pPr>
+        <w:rPr>
+          <w:rFonts w:ascii="Arial" w:hAnsi="Arial" w:cs="Arial"/>
+          <w:sz w:val="32"/>
+          <w:szCs w:val="32"/>
+        </w:rPr>
+      </w:pPr>
     </w:p>
     <w:sectPr>
       <w:pgSz w:w="12240" w:h="15840"/>

</xml_diff>

<commit_message>
Se espefica la maquina en la que se montara la base de datos
</commit_message>
<xml_diff>
--- a/Doc/Documentacion.docx
+++ b/Doc/Documentacion.docx
@@ -854,16 +854,14 @@
           <w:lang w:val="en-US"/>
         </w:rPr>
       </w:pPr>
-      <w:proofErr w:type="spellStart"/>
-      <w:r>
-        <w:rPr>
-          <w:rFonts w:ascii="Arial" w:hAnsi="Arial" w:cs="Arial"/>
-          <w:sz w:val="32"/>
-          <w:szCs w:val="32"/>
-        </w:rPr>
-        <w:t>Creacion</w:t>
-      </w:r>
-      <w:proofErr w:type="spellEnd"/>
+      <w:r>
+        <w:rPr>
+          <w:rFonts w:ascii="Arial" w:hAnsi="Arial" w:cs="Arial"/>
+          <w:sz w:val="32"/>
+          <w:szCs w:val="32"/>
+        </w:rPr>
+        <w:t>creación</w:t>
+      </w:r>
       <w:r>
         <w:rPr>
           <w:rFonts w:ascii="Arial" w:hAnsi="Arial" w:cs="Arial"/>
@@ -889,16 +887,14 @@
         </w:rPr>
         <w:t xml:space="preserve">Se </w:t>
       </w:r>
-      <w:proofErr w:type="gramStart"/>
-      <w:r>
-        <w:rPr>
-          <w:rFonts w:ascii="Arial" w:hAnsi="Arial" w:cs="Arial"/>
-          <w:sz w:val="32"/>
-          <w:szCs w:val="32"/>
-        </w:rPr>
-        <w:t>realizara</w:t>
-      </w:r>
-      <w:proofErr w:type="gramEnd"/>
+      <w:r>
+        <w:rPr>
+          <w:rFonts w:ascii="Arial" w:hAnsi="Arial" w:cs="Arial"/>
+          <w:sz w:val="32"/>
+          <w:szCs w:val="32"/>
+        </w:rPr>
+        <w:t>realizará</w:t>
+      </w:r>
       <w:r>
         <w:rPr>
           <w:rFonts w:ascii="Arial" w:hAnsi="Arial" w:cs="Arial"/>
@@ -924,6 +920,14 @@
           <w:szCs w:val="32"/>
         </w:rPr>
       </w:pPr>
+      <w:r>
+        <w:rPr>
+          <w:rFonts w:ascii="Arial" w:hAnsi="Arial" w:cs="Arial"/>
+          <w:sz w:val="32"/>
+          <w:szCs w:val="32"/>
+        </w:rPr>
+        <w:t>La base de datos se montará en la computadora de Diego con un Intel i5 y una gráfica 1050gtx.</w:t>
+      </w:r>
     </w:p>
     <w:sectPr>
       <w:pgSz w:w="12240" w:h="15840"/>

</xml_diff>

<commit_message>
Definicion de especificaciones de los campos de las base de datos
</commit_message>
<xml_diff>
--- a/Doc/Documentacion.docx
+++ b/Doc/Documentacion.docx
@@ -31,7 +31,6 @@
           <w:szCs w:val="32"/>
         </w:rPr>
       </w:pPr>
-      <w:proofErr w:type="spellStart"/>
       <w:r>
         <w:rPr>
           <w:rFonts w:ascii="Arial" w:hAnsi="Arial" w:cs="Arial"/>
@@ -40,53 +39,8 @@
           <w:sz w:val="32"/>
           <w:szCs w:val="32"/>
         </w:rPr>
-        <w:t>feat</w:t>
-      </w:r>
-      <w:proofErr w:type="spellEnd"/>
-      <w:r>
-        <w:rPr>
-          <w:rFonts w:ascii="Arial" w:hAnsi="Arial" w:cs="Arial"/>
-          <w:b/>
-          <w:bCs/>
-          <w:sz w:val="32"/>
-          <w:szCs w:val="32"/>
-        </w:rPr>
-        <w:t xml:space="preserve">: webcam </w:t>
-      </w:r>
-      <w:proofErr w:type="spellStart"/>
-      <w:r>
-        <w:rPr>
-          <w:rFonts w:ascii="Arial" w:hAnsi="Arial" w:cs="Arial"/>
-          <w:b/>
-          <w:bCs/>
-          <w:sz w:val="32"/>
-          <w:szCs w:val="32"/>
-        </w:rPr>
-        <w:t>showing</w:t>
-      </w:r>
-      <w:proofErr w:type="spellEnd"/>
-      <w:r>
-        <w:rPr>
-          <w:rFonts w:ascii="Arial" w:hAnsi="Arial" w:cs="Arial"/>
-          <w:b/>
-          <w:bCs/>
-          <w:sz w:val="32"/>
-          <w:szCs w:val="32"/>
-        </w:rPr>
-        <w:t xml:space="preserve"> </w:t>
-      </w:r>
-      <w:proofErr w:type="spellStart"/>
-      <w:r>
-        <w:rPr>
-          <w:rFonts w:ascii="Arial" w:hAnsi="Arial" w:cs="Arial"/>
-          <w:b/>
-          <w:bCs/>
-          <w:sz w:val="32"/>
-          <w:szCs w:val="32"/>
-        </w:rPr>
-        <w:t>image</w:t>
-      </w:r>
-      <w:proofErr w:type="spellEnd"/>
+        <w:t>feat: webcam showing image</w:t>
+      </w:r>
     </w:p>
     <w:p>
       <w:pPr>
@@ -145,25 +99,7 @@
           <w:sz w:val="32"/>
           <w:szCs w:val="32"/>
         </w:rPr>
-        <w:t>El usuario puede ver en pantalla lo que la cámara está capturando (</w:t>
-      </w:r>
-      <w:proofErr w:type="spellStart"/>
-      <w:r>
-        <w:rPr>
-          <w:rFonts w:ascii="Arial" w:hAnsi="Arial" w:cs="Arial"/>
-          <w:sz w:val="32"/>
-          <w:szCs w:val="32"/>
-        </w:rPr>
-        <w:t>stream</w:t>
-      </w:r>
-      <w:proofErr w:type="spellEnd"/>
-      <w:r>
-        <w:rPr>
-          <w:rFonts w:ascii="Arial" w:hAnsi="Arial" w:cs="Arial"/>
-          <w:sz w:val="32"/>
-          <w:szCs w:val="32"/>
-        </w:rPr>
-        <w:t xml:space="preserve"> en vivo).</w:t>
+        <w:t>El usuario puede ver en pantalla lo que la cámara está capturando (stream en vivo).</w:t>
       </w:r>
     </w:p>
     <w:p>
@@ -199,7 +135,6 @@
           <w:szCs w:val="32"/>
         </w:rPr>
       </w:pPr>
-      <w:proofErr w:type="spellStart"/>
       <w:r>
         <w:rPr>
           <w:rFonts w:ascii="Arial" w:hAnsi="Arial" w:cs="Arial"/>
@@ -208,53 +143,8 @@
           <w:sz w:val="32"/>
           <w:szCs w:val="32"/>
         </w:rPr>
-        <w:t>feat</w:t>
-      </w:r>
-      <w:proofErr w:type="spellEnd"/>
-      <w:r>
-        <w:rPr>
-          <w:rFonts w:ascii="Arial" w:hAnsi="Arial" w:cs="Arial"/>
-          <w:b/>
-          <w:bCs/>
-          <w:sz w:val="32"/>
-          <w:szCs w:val="32"/>
-        </w:rPr>
-        <w:t xml:space="preserve">: </w:t>
-      </w:r>
-      <w:proofErr w:type="spellStart"/>
-      <w:r>
-        <w:rPr>
-          <w:rFonts w:ascii="Arial" w:hAnsi="Arial" w:cs="Arial"/>
-          <w:b/>
-          <w:bCs/>
-          <w:sz w:val="32"/>
-          <w:szCs w:val="32"/>
-        </w:rPr>
-        <w:t>take</w:t>
-      </w:r>
-      <w:proofErr w:type="spellEnd"/>
-      <w:r>
-        <w:rPr>
-          <w:rFonts w:ascii="Arial" w:hAnsi="Arial" w:cs="Arial"/>
-          <w:b/>
-          <w:bCs/>
-          <w:sz w:val="32"/>
-          <w:szCs w:val="32"/>
-        </w:rPr>
-        <w:t xml:space="preserve"> </w:t>
-      </w:r>
-      <w:proofErr w:type="spellStart"/>
-      <w:r>
-        <w:rPr>
-          <w:rFonts w:ascii="Arial" w:hAnsi="Arial" w:cs="Arial"/>
-          <w:b/>
-          <w:bCs/>
-          <w:sz w:val="32"/>
-          <w:szCs w:val="32"/>
-        </w:rPr>
-        <w:t>photos</w:t>
-      </w:r>
-      <w:proofErr w:type="spellEnd"/>
+        <w:t>feat: take photos</w:t>
+      </w:r>
     </w:p>
     <w:p>
       <w:pPr>
@@ -292,25 +182,7 @@
           <w:sz w:val="32"/>
           <w:szCs w:val="32"/>
         </w:rPr>
-        <w:t xml:space="preserve"> a partir del </w:t>
-      </w:r>
-      <w:proofErr w:type="spellStart"/>
-      <w:r>
-        <w:rPr>
-          <w:rFonts w:ascii="Arial" w:hAnsi="Arial" w:cs="Arial"/>
-          <w:sz w:val="32"/>
-          <w:szCs w:val="32"/>
-        </w:rPr>
-        <w:t>preview</w:t>
-      </w:r>
-      <w:proofErr w:type="spellEnd"/>
-      <w:r>
-        <w:rPr>
-          <w:rFonts w:ascii="Arial" w:hAnsi="Arial" w:cs="Arial"/>
-          <w:sz w:val="32"/>
-          <w:szCs w:val="32"/>
-        </w:rPr>
-        <w:t>.</w:t>
+        <w:t> a partir del preview.</w:t>
       </w:r>
     </w:p>
     <w:p>
@@ -331,25 +203,7 @@
           <w:sz w:val="32"/>
           <w:szCs w:val="32"/>
         </w:rPr>
-        <w:t>La captura genera una imagen (</w:t>
-      </w:r>
-      <w:proofErr w:type="spellStart"/>
-      <w:r>
-        <w:rPr>
-          <w:rFonts w:ascii="Arial" w:hAnsi="Arial" w:cs="Arial"/>
-          <w:sz w:val="32"/>
-          <w:szCs w:val="32"/>
-        </w:rPr>
-        <w:t>snapshot</w:t>
-      </w:r>
-      <w:proofErr w:type="spellEnd"/>
-      <w:r>
-        <w:rPr>
-          <w:rFonts w:ascii="Arial" w:hAnsi="Arial" w:cs="Arial"/>
-          <w:sz w:val="32"/>
-          <w:szCs w:val="32"/>
-        </w:rPr>
-        <w:t>) para usarla en el flujo del sistema (por ejemplo: registro/validación facial o evidencia).</w:t>
+        <w:t>La captura genera una imagen (snapshot) para usarla en el flujo del sistema (por ejemplo: registro/validación facial o evidencia).</w:t>
       </w:r>
     </w:p>
     <w:p>
@@ -364,7 +218,6 @@
           <w:szCs w:val="32"/>
         </w:rPr>
       </w:pPr>
-      <w:proofErr w:type="spellStart"/>
       <w:r>
         <w:rPr>
           <w:rFonts w:ascii="Arial" w:hAnsi="Arial" w:cs="Arial"/>
@@ -373,75 +226,8 @@
           <w:sz w:val="32"/>
           <w:szCs w:val="32"/>
         </w:rPr>
-        <w:t>feat</w:t>
-      </w:r>
-      <w:proofErr w:type="spellEnd"/>
-      <w:r>
-        <w:rPr>
-          <w:rFonts w:ascii="Arial" w:hAnsi="Arial" w:cs="Arial"/>
-          <w:b/>
-          <w:bCs/>
-          <w:sz w:val="32"/>
-          <w:szCs w:val="32"/>
-        </w:rPr>
-        <w:t xml:space="preserve">: </w:t>
-      </w:r>
-      <w:proofErr w:type="spellStart"/>
-      <w:r>
-        <w:rPr>
-          <w:rFonts w:ascii="Arial" w:hAnsi="Arial" w:cs="Arial"/>
-          <w:b/>
-          <w:bCs/>
-          <w:sz w:val="32"/>
-          <w:szCs w:val="32"/>
-        </w:rPr>
-        <w:t>add</w:t>
-      </w:r>
-      <w:proofErr w:type="spellEnd"/>
-      <w:r>
-        <w:rPr>
-          <w:rFonts w:ascii="Arial" w:hAnsi="Arial" w:cs="Arial"/>
-          <w:b/>
-          <w:bCs/>
-          <w:sz w:val="32"/>
-          <w:szCs w:val="32"/>
-        </w:rPr>
-        <w:t xml:space="preserve"> </w:t>
-      </w:r>
-      <w:proofErr w:type="spellStart"/>
-      <w:r>
-        <w:rPr>
-          <w:rFonts w:ascii="Arial" w:hAnsi="Arial" w:cs="Arial"/>
-          <w:b/>
-          <w:bCs/>
-          <w:sz w:val="32"/>
-          <w:szCs w:val="32"/>
-        </w:rPr>
-        <w:t>toggle</w:t>
-      </w:r>
-      <w:proofErr w:type="spellEnd"/>
-      <w:r>
-        <w:rPr>
-          <w:rFonts w:ascii="Arial" w:hAnsi="Arial" w:cs="Arial"/>
-          <w:b/>
-          <w:bCs/>
-          <w:sz w:val="32"/>
-          <w:szCs w:val="32"/>
-        </w:rPr>
-        <w:t xml:space="preserve"> </w:t>
-      </w:r>
-      <w:proofErr w:type="spellStart"/>
-      <w:r>
-        <w:rPr>
-          <w:rFonts w:ascii="Arial" w:hAnsi="Arial" w:cs="Arial"/>
-          <w:b/>
-          <w:bCs/>
-          <w:sz w:val="32"/>
-          <w:szCs w:val="32"/>
-        </w:rPr>
-        <w:t>button</w:t>
-      </w:r>
-      <w:proofErr w:type="spellEnd"/>
+        <w:t>feat: add toggle button</w:t>
+      </w:r>
     </w:p>
     <w:p>
       <w:pPr>
@@ -471,45 +257,15 @@
           <w:sz w:val="32"/>
           <w:szCs w:val="32"/>
         </w:rPr>
-        <w:t xml:space="preserve">botón tipo </w:t>
-      </w:r>
-      <w:proofErr w:type="spellStart"/>
-      <w:r>
-        <w:rPr>
-          <w:rFonts w:ascii="Arial" w:hAnsi="Arial" w:cs="Arial"/>
-          <w:b/>
-          <w:bCs/>
-          <w:sz w:val="32"/>
-          <w:szCs w:val="32"/>
-        </w:rPr>
-        <w:t>toggle</w:t>
-      </w:r>
-      <w:proofErr w:type="spellEnd"/>
-      <w:r>
-        <w:rPr>
-          <w:rFonts w:ascii="Arial" w:hAnsi="Arial" w:cs="Arial"/>
-          <w:sz w:val="32"/>
-          <w:szCs w:val="32"/>
-        </w:rPr>
-        <w:t> para controlar la cámara/</w:t>
-      </w:r>
-      <w:proofErr w:type="spellStart"/>
-      <w:r>
-        <w:rPr>
-          <w:rFonts w:ascii="Arial" w:hAnsi="Arial" w:cs="Arial"/>
-          <w:sz w:val="32"/>
-          <w:szCs w:val="32"/>
-        </w:rPr>
-        <w:t>preview</w:t>
-      </w:r>
-      <w:proofErr w:type="spellEnd"/>
-      <w:r>
-        <w:rPr>
-          <w:rFonts w:ascii="Arial" w:hAnsi="Arial" w:cs="Arial"/>
-          <w:sz w:val="32"/>
-          <w:szCs w:val="32"/>
-        </w:rPr>
-        <w:t>.</w:t>
+        <w:t>botón tipo toggle</w:t>
+      </w:r>
+      <w:r>
+        <w:rPr>
+          <w:rFonts w:ascii="Arial" w:hAnsi="Arial" w:cs="Arial"/>
+          <w:sz w:val="32"/>
+          <w:szCs w:val="32"/>
+        </w:rPr>
+        <w:t> para controlar la cámara/preview.</w:t>
       </w:r>
     </w:p>
     <w:p>
@@ -548,25 +304,7 @@
           <w:sz w:val="32"/>
           <w:szCs w:val="32"/>
         </w:rPr>
-        <w:t xml:space="preserve"> la cámara o mostrar/ocultar el </w:t>
-      </w:r>
-      <w:proofErr w:type="spellStart"/>
-      <w:r>
-        <w:rPr>
-          <w:rFonts w:ascii="Arial" w:hAnsi="Arial" w:cs="Arial"/>
-          <w:sz w:val="32"/>
-          <w:szCs w:val="32"/>
-        </w:rPr>
-        <w:t>preview</w:t>
-      </w:r>
-      <w:proofErr w:type="spellEnd"/>
-      <w:r>
-        <w:rPr>
-          <w:rFonts w:ascii="Arial" w:hAnsi="Arial" w:cs="Arial"/>
-          <w:sz w:val="32"/>
-          <w:szCs w:val="32"/>
-        </w:rPr>
-        <w:t xml:space="preserve"> según el estado.</w:t>
+        <w:t> la cámara o mostrar/ocultar el preview según el estado.</w:t>
       </w:r>
     </w:p>
     <w:p>
@@ -671,25 +409,7 @@
           <w:sz w:val="32"/>
           <w:szCs w:val="32"/>
         </w:rPr>
-        <w:t xml:space="preserve">Ve el </w:t>
-      </w:r>
-      <w:proofErr w:type="spellStart"/>
-      <w:r>
-        <w:rPr>
-          <w:rFonts w:ascii="Arial" w:hAnsi="Arial" w:cs="Arial"/>
-          <w:sz w:val="32"/>
-          <w:szCs w:val="32"/>
-        </w:rPr>
-        <w:t>preview</w:t>
-      </w:r>
-      <w:proofErr w:type="spellEnd"/>
-      <w:r>
-        <w:rPr>
-          <w:rFonts w:ascii="Arial" w:hAnsi="Arial" w:cs="Arial"/>
-          <w:sz w:val="32"/>
-          <w:szCs w:val="32"/>
-        </w:rPr>
-        <w:t xml:space="preserve"> en vivo.</w:t>
+        <w:t>Ve el preview en vivo.</w:t>
       </w:r>
     </w:p>
     <w:p>
@@ -712,7 +432,6 @@
         </w:rPr>
         <w:t>Puede presionar </w:t>
       </w:r>
-      <w:proofErr w:type="spellStart"/>
       <w:r>
         <w:rPr>
           <w:rFonts w:ascii="Arial" w:hAnsi="Arial" w:cs="Arial"/>
@@ -723,7 +442,6 @@
         </w:rPr>
         <w:t>toggle</w:t>
       </w:r>
-      <w:proofErr w:type="spellEnd"/>
       <w:r>
         <w:rPr>
           <w:rFonts w:ascii="Arial" w:hAnsi="Arial" w:cs="Arial"/>
@@ -927,6 +645,23 @@
           <w:szCs w:val="32"/>
         </w:rPr>
         <w:t>La base de datos se montará en la computadora de Diego con un Intel i5 y una gráfica 1050gtx.</w:t>
+      </w:r>
+    </w:p>
+    <w:p>
+      <w:pPr>
+        <w:rPr>
+          <w:rFonts w:ascii="Arial" w:hAnsi="Arial" w:cs="Arial"/>
+          <w:sz w:val="32"/>
+          <w:szCs w:val="32"/>
+        </w:rPr>
+      </w:pPr>
+      <w:r>
+        <w:rPr>
+          <w:rFonts w:ascii="Arial" w:hAnsi="Arial" w:cs="Arial"/>
+          <w:sz w:val="32"/>
+          <w:szCs w:val="32"/>
+        </w:rPr>
+        <w:t>Los campos, tuplas y claves primarias fueron especificados en PostgreSQL.</w:t>
       </w:r>
     </w:p>
     <w:sectPr>

</xml_diff>